<commit_message>
Split Leadership & Ventures into separate Leadership and Entrepreneurial Ventures sections (general resume)
Co-Authored-By: Claude Opus 4.8 <noreply@anthropic.com>
Claude-Session: https://claude.ai/code/session_01MGPZcXnveR1LfyWB2KFgzx
</commit_message>
<xml_diff>
--- a/general-application/Garvit_Saraf_Resume.docx
+++ b/general-application/Garvit_Saraf_Resume.docx
@@ -536,7 +536,7 @@
           <w:sz w:val="20"/>
           <w:szCs w:val="20"/>
         </w:rPr>
-        <w:t xml:space="preserve">Leadership &amp; Ventures</w:t>
+        <w:t xml:space="preserve">Leadership</w:t>
       </w:r>
     </w:p>
     <w:p>
@@ -586,6 +586,76 @@
           <w:rFonts w:ascii="Arial" w:cs="Arial" w:eastAsia="Arial" w:hAnsi="Arial"/>
         </w:rPr>
         <w:t xml:space="preserve">Ran 15+ events including INNOWAVE 2025, a three-day international conference; onboarded speakers, secured sponsorships, led the documentation committee, and authored a nationally published feature in The Hindu.</w:t>
+      </w:r>
+    </w:p>
+    <w:p>
+      <w:pPr>
+        <w:pStyle w:val="ListParagraph"/>
+        <w:numPr>
+          <w:ilvl w:val="0"/>
+          <w:numId w:val="2"/>
+        </w:numPr>
+        <w:spacing w:after="0" w:line="248"/>
+      </w:pPr>
+      <w:r>
+        <w:rPr>
+          <w:rFonts w:ascii="Arial" w:cs="Arial" w:eastAsia="Arial" w:hAnsi="Arial"/>
+          <w:b/>
+          <w:bCs/>
+          <w:color w:val="1A1A1A"/>
+        </w:rPr>
+        <w:t xml:space="preserve">Departmental Representative, Centre for Social Action</w:t>
+      </w:r>
+      <w:r>
+        <w:rPr>
+          <w:rFonts w:ascii="Arial" w:cs="Arial" w:eastAsia="Arial" w:hAnsi="Arial"/>
+        </w:rPr>
+        <w:t xml:space="preserve">, CHRIST University</w:t>
+      </w:r>
+      <w:r>
+        <w:ptab w:alignment="right" w:relativeTo="margin" w:leader="none"/>
+      </w:r>
+      <w:r>
+        <w:rPr>
+          <w:rFonts w:ascii="Arial" w:cs="Arial" w:eastAsia="Arial" w:hAnsi="Arial"/>
+          <w:color w:val="5C5C5C"/>
+          <w:sz w:val="17"/>
+          <w:szCs w:val="17"/>
+        </w:rPr>
+        <w:t xml:space="preserve">2023 to 2025</w:t>
+      </w:r>
+    </w:p>
+    <w:p>
+      <w:pPr>
+        <w:spacing w:after="55" w:line="248"/>
+        <w:ind w:left="250"/>
+      </w:pPr>
+      <w:r>
+        <w:rPr>
+          <w:rFonts w:ascii="Arial" w:cs="Arial" w:eastAsia="Arial" w:hAnsi="Arial"/>
+        </w:rPr>
+        <w:t xml:space="preserve">Organised the CSA Alumni Meet and Silver Jubilee celebrations; supervised media, hospitality, and documentation for nationwide social-impact initiatives.</w:t>
+      </w:r>
+    </w:p>
+    <w:p>
+      <w:pPr>
+        <w:pBdr>
+          <w:bottom w:val="single" w:color="B9C4D4" w:sz="5"/>
+        </w:pBdr>
+        <w:spacing w:after="55" w:before="150"/>
+      </w:pPr>
+      <w:r>
+        <w:rPr>
+          <w:rFonts w:ascii="Arial" w:cs="Arial" w:eastAsia="Arial" w:hAnsi="Arial"/>
+          <w:b/>
+          <w:bCs/>
+          <w:caps/>
+          <w:color w:val="1C3A5E"/>
+          <w:spacing w:val="38"/>
+          <w:sz w:val="20"/>
+          <w:szCs w:val="20"/>
+        </w:rPr>
+        <w:t xml:space="preserve">Entrepreneurial Ventures</w:t>
       </w:r>
     </w:p>
     <w:p>

</xml_diff>